<commit_message>
Consolidate manuscript to canonical npj version; reconcile zero-shot accuracy
- Sync repo manuscript/ to the newest npj copy (5,735 words): updated
  manuscript.docx/pdf, added manuscript_with_figures.docx, refreshed all 8
  main figures (incl. redesigned Figure 8 ggKEGG legend), synced cover letter.
- Add manuscript/README.md listing all 8 figures (was 6).
- Zero-shot loose accuracy standardized to 28.1% (2810/9998); manuscripts
  already used 28.1%, only the source report drifted to 27.7%.

Co-Authored-By: Claude Fable 5 <noreply@anthropic.com>
</commit_message>
<xml_diff>
--- a/manuscript/manuscript.docx
+++ b/manuscript/manuscript.docx
@@ -399,7 +399,7 @@
     <w:p>
       <w:pPr/>
       <w:r>
-        <w:t>To investigate whether the Ca2+-dominant CCC network extends to K+ transport, we expanded the pathway to include all six major K+ channels (AKT1, AKT2, GORK, KAT1, KAT2, KC1) and examined their co-expression and cell-to-cell communication patterns. AKT1 (AT2G26650), the primary Ca2+-regulated K+ uptake channel, was linked to the Ca2+ network via the CBL9-CIPK23-AKT1 cascade, in which Ca2+-bound CBL9 recruits CIPK23 to phosphorylate and activate AKT1 at the plasma membrane. This crosstalk edge connects the two signaling systems into a unified 27-node, 67-edge network (Figure 7A). Co-expression analysis revealed that the Ca2+/K+ circuit genes are weakly correlated globally (r &lt; 0.1 for most pairs) but show strong cell-type-specific co-expression in guard cells (n = 89), where CDPK4-ANNAT1 (r = 0.56), CIPK23-CaM3 (r = 0.46), and CBL9-AKT1 (r = 0.34) form a tightly coordinated module (Figure 7B). In other cell types, correlations remain weak (r &lt; 0.1), suggesting that the circuit operates primarily in guard cells within this seedling atlas. Cell-cell communication analysis confirmed that Ca2+ signaling (total strength 249.5) is 10.2-fold stronger than K+ signaling (24.5). Guard cells are the dominant Ca2+ source, sending signals to meristematic (strength 12.14), epidermal (11.20), and stele (11.09) cells, while epidermal cells are the primary K+ source (Figure 7D). The top K+ ligand-receptor pair is KC1 (AT4G30960) to AKT1 (strength 5.01). Spatial mapping using ggPlantmap projected the six key circuit genes (AKT1, CBL9, CIPK23, CML24, KC1, CDPK3) onto seedling anatomy using cell-type expression as a proxy, revealing highest expression in cotyledon (mesophyll/guard) and root (stele/meristematic) regions (Figure 7C). Marker-based organ inference was attempted using 15 tissue-specific markers (SCR, PLT1, WOL for root; RBCS, FSD1 for leaf; LEC2, 2S3 for seed), but photosynthetic markers were ubiquitous (RBCS in 93-98% of all cells) and root markers were near-absent (SCR &lt; 3%), precluding reliable organ separation in this whole-seedling atlas. Cell-type proxy mapping was therefore used as the more defensible approach. Mapping the CBL9-CIPK23-AKT1 cascade onto the KEGG plant hormone signal transduction reference pathway (ath04075) and pairing it with a molecular cascade Sankey weighted by guard cell expression confirms that guard cells show the dominant Ca2+ response and that the cascade converges on AKT1-mediated cellular K+ uptake (Figure 8). The spatial distribution of circuit genes across seedling, root tip, and leaf anatomy is shown in Supplementary Figure S3.</w:t>
+        <w:t>To investigate whether the Ca2+-dominant CCC network extends to K+ transport, we expanded the pathway to include all six major K+ channels (AKT1, AKT2, GORK, KAT1, KAT2, KC1) and examined their co-expression and cell-to-cell communication patterns. AKT1 (AT2G26650), the primary Ca2+-regulated K+ uptake channel, was linked to the Ca2+ network via the CBL9-CIPK23-AKT1 cascade, in which Ca2+-bound CBL9 recruits CIPK23 to phosphorylate and activate AKT1 at the plasma membrane. This crosstalk edge connects the two signaling systems into a unified 27-node, 67-edge network (Figure 7A). Co-expression analysis revealed that the Ca2+/K+ circuit genes are weakly correlated globally (r &lt; 0.1 for most pairs) but show strong cell-type-specific co-expression in guard cells (n = 89), where CDPK4-ANNAT1 (r = 0.56), CIPK23-CaM3 (r = 0.46), and CBL9-AKT1 (r = 0.34) form a tightly coordinated module (Figure 7B). In other cell types, correlations remain weak (r &lt; 0.1), suggesting that the circuit operates primarily in guard cells within this seedling atlas. Cell-cell communication analysis confirmed that Ca2+ signaling (total strength 249.5) is 10.2-fold stronger than K+ signaling (24.5). Guard cells are the dominant Ca2+ source, sending signals to meristematic (strength 12.14), epidermal (11.20), and stele (11.09) cells, while epidermal cells are the primary K+ source (Figure 7D). The top K+ ligand-receptor pair is KC1 (AT4G30960) to AKT1 (strength 5.01). Spatial mapping using ggPlantmap projected the six key circuit genes (AKT1, CBL9, CIPK23, CML24, KC1, CDPK3) onto seedling anatomy using cell-type expression as a proxy, revealing highest expression in cotyledon (mesophyll/guard) and root (stele/meristematic) regions (Figure 7C). Marker-based organ inference was attempted using 15 tissue-specific markers (SCR, PLT1, WOL for root; RBCS, FSD1 for leaf; LEC2, 2S3 for seed), but photosynthetic markers were ubiquitous (RBCS in 93-98% of all cells) and root markers were near-absent (SCR &lt; 3%), precluding reliable organ separation in this whole-seedling atlas. Cell-type proxy mapping was therefore used as the more defensible approach. A focused ggpathway cascade network (12 nodes, stress-majorization layout) paired with a ggPlantmap leaf cross-section confirms that guard cells show the dominant Ca²⁺ CCC response (outgoing strength 57.1, highest of all cell types) and that the cascade converges on AKT1-mediated K⁺ uptake (epidermal AKT1 expression 0.367, highest across cell types); a molecular cascade Sankey weighted by guard cell expression summarises the full signal flow (Figure 8). The spatial distribution of circuit genes across seedling, root tip, and leaf anatomy is shown in Supplementary Figure S3.</w:t>
       </w:r>
     </w:p>
     <w:p>
@@ -699,7 +699,7 @@
     <w:p>
       <w:pPr/>
       <w:r>
-        <w:t>The Ca2+ pathway network was expanded to include six K+ channels (AKT1/AT2G26650, AKT2/AT5G46240, GORK/AT4G18290, KAT1/AT5G37500, KAT2/AT4G22200, KC1/AT4G30960) identified from the PlantCellChat K+ pathway database. The CBL9-CIPK23-AKT1 crosstalk edge was added based on literature evidence. The resulting 27-node, 67-edge network was visualized using ggpathway (ggraph + igraph) with stress-majorization layout (graphlayouts::layout_with_stress, seed = 42). Co-expression was computed as Pearson correlation of normalized expression across all cells and per cell type. Cell-cell communication strength for Ca2+ and K+ pathways was extracted from PlantCellChat outputs and aggregated into 5x5 source-target matrices. The CCC circuit diagram was rendered as a circular network with Ca2+ (blue) and K+ (green) edges. Spatial visualization used ggPlantmap seedling (ggPm.At.seedling.saltdrought), root tip longitudinal (ggPm.At.roottip.longitudinal), and leaf cross-section (ggPm.At.leaf.crosssection) maps, with cell-type mean expression mapped to organ regions as a proxy (cotyledon = mesophyll + guard average; hypocotyl = epidermal + stele average; root = stele + meristematic average). Marker-based organ inference was tested using 15 tissue-specific markers but was not reliable in this whole-seedling atlas. A two-panel Figure 8 was constructed to summarize the cascade: panel a maps the CBL9-CIPK23-AKT1 cascade onto the KEGG reference pathway ath04075 (Plant hormone signal transduction) using the ggkegg R package, with CDPK/CIPK and CaM genes highlighted on their native KEGG nodes and genes absent from KEGG (CBL9, CBL1, CBL2, CML24, AKT1, KC1, ANNAT1) added as custom nodes colored by guard cell expression; panel b is a Plotly Sankey diagram of the molecular cascade (CBL9-CIPK23-AKT1) with guard cell expression values as flow widths. A supplementary ggPlantmap montage combined the seedling, root tip, and leaf maps into a single three-panel figure.</w:t>
+        <w:t>The Ca2+ pathway network was expanded to include six K+ channels (AKT1/AT2G26650, AKT2/AT5G46240, GORK/AT4G18290, KAT1/AT5G37500, KAT2/AT4G22200, KC1/AT4G30960) identified from the PlantCellChat K+ pathway database. The CBL9-CIPK23-AKT1 crosstalk edge was added based on literature evidence. The resulting 27-node, 67-edge network was visualized using ggpathway (ggraph + igraph) with stress-majorization layout (graphlayouts::layout_with_stress, seed = 42). Co-expression was computed as Pearson correlation of normalized expression across all cells and per cell type. Cell-cell communication strength for Ca2+ and K+ pathways was extracted from PlantCellChat outputs and aggregated into 5x5 source-target matrices. The CCC circuit diagram was rendered as a circular network with Ca2+ (blue) and K+ (green) edges. Spatial visualization used ggPlantmap seedling (ggPm.At.seedling.saltdrought), root tip longitudinal (ggPm.At.roottip.longitudinal), and leaf cross-section (ggPm.At.leaf.crosssection) maps, with cell-type mean expression mapped to organ regions as a proxy (cotyledon = mesophyll + guard average; hypocotyl = epidermal + stele average; root = stele + meristematic average). Marker-based organ inference was tested using 15 tissue-specific markers but was not reliable in this whole-seedling atlas. A two-panel Figure 8 was constructed to summarize the cascade. Panel a comprises two sub-panels: (a1) a focused 12-node CBL9–CIPK23–AKT1 cascade network built with ggpathway (ggraph + igraph, graphlayouts::layout_with_stress, seed = 42), with nodes colored by functional type and sized by guard cell expression, and key co-expression correlations labeled on edges; (a2) a ggPlantmap leaf cross-section (ggPm.At.leaf.crosssection) showing Ca²⁺ CCC outgoing strength (blue gradient) and AKT1 expression (green gradient) per cell type, with ROI mapping: epidermis.stomata → Guard, Parenchima.palisade/sponge → Mesophyll, epidermis.adaxial/abaxial → Epidermal, vascularbundle.* → Stele. Panel b is a matplotlib Sankey diagram of the molecular cascade with guard cell expression values as flow widths and column headers indicating cascade stages. Three supplementary ggPlantmap figures were generated: (S3a) seed developmental series (ggPm.At.seed.devseries, 5 stages) showing CBL9, CIPK23, and AKT1 expression with proxy cell-type mapping (Embryo Proper → Meristematic; Endosperm → Stele/Mesophyll; Seed Coat → Epidermal); (S3b) root mature cross-section (ggPm.At.rootmatur.crosssection, 8 ROIs) showing Ca²⁺/K⁺ CCC strength and AKT1/CBL9 expression with proxy mapping (Atrichoblast/Trichoblast → Epidermal; Cortex/Endodermis → Mesophyll; Pericycle/Phloem/Xylem → Stele; Procambium → Meristematic); (S3c) young seedling (ggPm.At.seedling.saltdrought, all 12 ROIs) showing Ca²⁺/K⁺ CCC strength and AKT1/CBL9 expression with organ-level proxy mapping.</w:t>
       </w:r>
     </w:p>
     <w:p>
@@ -1027,13 +1027,15 @@
     <w:p>
       <w:pPr/>
       <w:r>
-        <w:t>Figure 8. CBL9-CIPK23-AKT1 cascade: KEGG pathway overlay and molecular cascade.</w:t>
+        <w:rPr/>
+        <w:t>Figure 8. CBL9–CIPK23–AKT1 cascade: KEGG systems biology context, spatial expression, and molecular cascade.</w:t>
       </w:r>
     </w:p>
     <w:p>
       <w:pPr/>
       <w:r>
-        <w:t>a) KEGG pathway overlay: the CBL9-CIPK23-AKT1 cascade mapped onto KEGG reference pathway ath04075 (Plant hormone signal transduction). The KEGG map is shown as the background; CDPK4/CDPK3/CIPK23 (orange) and CaM3/CaM7 (pink) are highlighted on their native KEGG nodes. Circuit genes absent from KEGG (CBL9, CBL1, CBL2, CML24, AKT1, KC1, ANNAT1) are added as custom nodes colored by guard cell expression (blue gradient). Arrows trace the signal flow Ca2+ -&gt; CBL9 -&gt; CIPK23 -&gt; AKT1 -&gt; K+ uptake, with guard cell co-expression correlations labeled on key edges (CBL9-AKT1 r = 0.34, CBL9-CIPK23 r = -0.05). Guard cells show the dominant Ca2+ response, and the cascade converges on AKT1-mediated cellular K+ uptake. b) Molecular cascade: Sankey diagram tracing the CBL9-CIPK23-AKT1 pathway from Ca2+ entry through calcium sensors (CBL1, CBL9, CaM3, CML24) to kinases (CIPK23, CDPK3, CDPK4) to effectors (AKT1, ANNAT1, KC1) and K+ uptake. Flow widths are proportional to guard cell expression values. Edge labels show guard cell co-expression correlations (e.g., CBL9-AKT1 r = 0.34, CIPK23-CaM3 r = 0.46, CDPK4-ANNAT1 r = 0.56).</w:t>
+        <w:rPr/>
+        <w:t>a) Left sub-panel (i): ggKEGG systems biology overlay on the Arabidopsis KEGG pathway ath04075 (Plant hormone signal transduction). Nodes containing CIPK23/CDPK3/CDPK4 are highlighted in blue; CaM3/CaM7 nodes are highlighted in pink. The bar chart inset shows guard cell mean expression for all 11 circuit genes; blue bars indicate genes present in ath04075, grey bars indicate genes added as custom overlay nodes (CBL9, CBL1, CBL2, CML24, AKT1, KC1, ANNAT1). Middle sub-panels: ggPlantmap leaf cross-sections showing spatial expression across four cell types (Guard, Mesophyll, Epidermal, Stele) mapped from the Shahan et al. 2022 whole-seedling atlas. Sub-panel (ii): CIPK23 expression (orange gradient; Epidermal/Meristematic highest, mean = 0.139/0.151), showing that the Ca²⁺-activated kinase is broadly expressed across leaf cell types. Sub-panel (iii): AKT1 expression (green gradient; Epidermal highest, mean = 0.367), confirming that the K⁺ channel target of CIPK23 phosphorylation is most abundant in epidermal cells. Together, sub-panels (i)–(iii) complete the CBL9→CIPK23→AKT1 spatial story: Ca²⁺ signal is sensed by CBL9 (guard cells), activates CIPK23 (broadly expressed, epidermal/meristematic highest), which phosphorylates AKT1 (epidermal highest) to drive K⁺ uptake. b) Molecular cascade: Sankey diagram tracing the CBL9–CIPK23–AKT1 pathway from Ca²⁺ entry through calcium sensors (CBL1, CBL9, CaM3, CML24) to kinases (CIPK23, CDPK3, CDPK4) to effectors (AKT1, ANNAT1, KC1) and K⁺ uptake. Flow widths are proportional to guard cell expression values. Column headers indicate cascade stages (Signal, Sensors, Kinases, Channels, Output). Key co-expression correlations are labeled on selected edges (CDPK4–ANNAT1 r = 0.56, CaM3–CDPK4 r = 0.15, CML24–KC1 r = −0.18).</w:t>
       </w:r>
     </w:p>
     <w:p>
@@ -1071,13 +1073,14 @@
     <w:p>
       <w:pPr/>
       <w:r>
-        <w:t>Supplementary Figure S3. Spatial expression of Ca2+/K+ circuit genes across Arabidopsis anatomy.</w:t>
+        <w:t>Supplementary Figure S3. Spatial expression of Ca²⁺/K⁺ circuit genes across Arabidopsis anatomy.</w:t>
       </w:r>
     </w:p>
     <w:p>
       <w:pPr/>
       <w:r>
-        <w:t>Three-panel ggPlantmap montage: a) Seedling map (cotyledon, hypocotyl, root) showing expression of 6 key circuit genes (AKT1, CBL9, CIPK23, CML24, KC1, CDPK3). b) Root tip longitudinal section showing Ca2+ cascade gene expression across 12 root zones. c) Leaf cross-section showing K+ channel distribution across 8 leaf regions. Cell-type expression was used as a proxy for organ mapping (cotyledon = mesophyll + guard; root = stele + meristematic).</w:t>
+        <w:rPr/>
+        <w:t>Three ggPlantmap figures showing Ca²⁺/K⁺ circuit gene expression and CCC signaling strength across Arabidopsis anatomical contexts. a) Seed developmental series (ggPm.At.seed.devseries): expression of CBL9 (blue), CIPK23 (green), and AKT1 (orange) across five developmental stages (Preglobular, Globular, Heart, Linearcotyledon, Maturegreen). Cell-type proxy mapping: Embryo Proper → Meristematic; Micropylar/Peripheral Endosperm → Stele; Chalazal Endosperm → Mesophyll; Distal/Chalazal Seed Coat → Epidermal. b) Root mature cross-section (ggPm.At.rootmatur.crosssection, 8 ROIs): four sub-maps showing (i) Ca²⁺ CCC outgoing strength (blue; Meristematic/Procambium highest), (ii) K⁺ CCC outgoing strength (green; Epidermal/Atrichoblast highest), (iii) AKT1 expression (orange; Epidermal highest), and (iv) CBL9 expression (pink; Epidermal highest). Cell-type proxy: Atrichoblast/Trichoblast → Epidermal; Cortex/Endodermis → Mesophyll; Pericycle/Phloem/Xylem → Stele; Procambium → Meristematic. c) Young seedling (ggPm.At.seedling.saltdrought, all 12 ROIs including control, NaCl, and Sorbitol treatments): four sub-maps showing (i) Ca²⁺ CCC outgoing strength (blue; Cotyledon highest via guard+mesophyll proxy), (ii) K⁺ CCC outgoing strength (green; Hypocotyl highest via epidermal+stele proxy), (iii) AKT1 expression (orange; Hypocotyl highest), and (iv) CBL9 expression (pink; Hypocotyl highest). Organ proxy: Cotyledon → Mesophyll+Guard avg; Hypocotyl → Epidermal+Stele avg; Root → Stele+Meristematic avg; Hook → all cell types avg. Note: proxy mapping is used because the scRNA-seq atlas does not include seed or root-specific cell types; values represent the best available approximation from the whole-seedling atlas.</w:t>
       </w:r>
     </w:p>
     <w:p>

</xml_diff>